<commit_message>
fixed minor documentation errors
</commit_message>
<xml_diff>
--- a/Documentation/Tutorial Document.docx
+++ b/Documentation/Tutorial Document.docx
@@ -201,20 +201,15 @@
         </w:rPr>
         <w:t xml:space="preserve">cd </w:t>
       </w:r>
-      <w:r>
-        <w:rPr>
-          <w:b w:val="0"/>
-          <w:bCs w:val="0"/>
-        </w:rPr>
-        <w:t>o</w:t>
-      </w:r>
-      <w:r>
-        <w:rPr>
-          <w:b w:val="0"/>
-          <w:bCs w:val="0"/>
-        </w:rPr>
-        <w:t>zoo</w:t>
-      </w:r>
+      <w:proofErr w:type="spellStart"/>
+      <w:r>
+        <w:rPr>
+          <w:b w:val="0"/>
+          <w:bCs w:val="0"/>
+        </w:rPr>
+        <w:t>OzZoo</w:t>
+      </w:r>
+      <w:proofErr w:type="spellEnd"/>
     </w:p>
     <w:p>
       <w:pPr>
@@ -372,7 +367,7 @@
     <w:p>
       <w:r>
         <w:pict w14:anchorId="3CCC5178">
-          <v:rect id="_x0000_i1035" style="width:0;height:1.5pt" o:hralign="center" o:hrstd="t" o:hr="t" fillcolor="#a0a0a0" stroked="f"/>
+          <v:rect id="_x0000_i1026" style="width:0;height:1.5pt" o:hralign="center" o:hrstd="t" o:hr="t" fillcolor="#a0a0a0" stroked="f"/>
         </w:pict>
       </w:r>
     </w:p>

</xml_diff>